<commit_message>
phase 2 complete fr
</commit_message>
<xml_diff>
--- a/phase2/errorspotlight.docx
+++ b/phase2/errorspotlight.docx
@@ -661,7 +661,10 @@
           </w:tcPr>
           <w:p>
             <w:r>
-              <w:t>$AMJ000600220006</w:t>
+              <w:t>$AMJ00060022000</w:t>
+            </w:r>
+            <w:r>
+              <w:t>8</w:t>
             </w:r>
           </w:p>
           <w:p>
@@ -697,7 +700,10 @@
           </w:tcPr>
           <w:p>
             <w:r>
-              <w:t>$AMJ000600220006</w:t>
+              <w:t>$AMJ00060022000</w:t>
+            </w:r>
+            <w:r>
+              <w:t>8</w:t>
             </w:r>
           </w:p>
           <w:p>
@@ -813,19 +819,7 @@
               <w:rPr>
                 <w:highlight w:val="yellow"/>
               </w:rPr>
-              <w:t>PD</w:t>
-            </w:r>
-            <w:r>
-              <w:rPr>
-                <w:highlight w:val="yellow"/>
-              </w:rPr>
-              <w:t>8</w:t>
-            </w:r>
-            <w:r>
-              <w:rPr>
-                <w:highlight w:val="yellow"/>
-              </w:rPr>
-              <w:t>0</w:t>
+              <w:t>PD80</w:t>
             </w:r>
           </w:p>
           <w:p>

</xml_diff>